<commit_message>
add lab 02 report
</commit_message>
<xml_diff>
--- a/Lab_2/CG-Lab02-Materials/Lab02/CG-Lab02-ITCSIU24045-Vo Tri Khoi.docx
+++ b/Lab_2/CG-Lab02-Materials/Lab02/CG-Lab02-ITCSIU24045-Vo Tri Khoi.docx
@@ -2866,23 +2866,7 @@
           <w:b/>
           <w:bCs/>
         </w:rPr>
-        <w:t>Derive these equations from the unit circle definition. What is the translation matrix for a point (0,0,1) moved to (</w:t>
-      </w:r>
-      <w:proofErr w:type="gramStart"/>
-      <w:r>
-        <w:rPr>
-          <w:b/>
-          <w:bCs/>
-        </w:rPr>
-        <w:t>x,y</w:t>
-      </w:r>
-      <w:proofErr w:type="gramEnd"/>
-      <w:r>
-        <w:rPr>
-          <w:b/>
-          <w:bCs/>
-        </w:rPr>
-        <w:t>) on the circle?</w:t>
+        <w:t>Derive these equations from the unit circle definition. What is the translation matrix for a point (0,0,1) moved to (x,y) on the circle?</w:t>
       </w:r>
     </w:p>
     <w:p>
@@ -3458,21 +3442,7 @@
         <w:rPr>
           <w:rFonts w:eastAsia="Times New Roman"/>
         </w:rPr>
-        <w:t xml:space="preserve">Rearranging these gives </w:t>
-      </w:r>
-      <w:proofErr w:type="gramStart"/>
-      <w:r>
-        <w:rPr>
-          <w:rFonts w:eastAsia="Times New Roman"/>
-        </w:rPr>
-        <w:t>the parametric</w:t>
-      </w:r>
-      <w:proofErr w:type="gramEnd"/>
-      <w:r>
-        <w:rPr>
-          <w:rFonts w:eastAsia="Times New Roman"/>
-        </w:rPr>
-        <w:t xml:space="preserve"> equations for a circle: </w:t>
+        <w:t xml:space="preserve">Rearranging these gives the parametric equations for a circle: </w:t>
       </w:r>
       <m:oMath>
         <m:r>
@@ -3925,7 +3895,7 @@
           <w:b/>
           <w:bCs/>
         </w:rPr>
-        <w:t xml:space="preserve">3. </w:t>
+        <w:t>3.</w:t>
       </w:r>
       <w:r>
         <w:rPr>
@@ -4199,12 +4169,15 @@
     <w:p>
       <w:pPr>
         <w:pStyle w:val="Text"/>
-        <w:ind w:left="1440"/>
+        <w:ind w:left="0"/>
         <w:rPr>
           <w:rFonts w:eastAsia="Times New Roman"/>
         </w:rPr>
       </w:pPr>
       <m:oMathPara>
+        <m:oMathParaPr>
+          <m:jc m:val="center"/>
+        </m:oMathParaPr>
         <m:oMath>
           <m:r>
             <m:rPr>
@@ -4283,6 +4256,9 @@
             <m:t>=0</m:t>
           </m:r>
           <m:r>
+            <m:rPr>
+              <m:sty m:val="p"/>
+            </m:rPr>
             <w:rPr>
               <w:rFonts w:eastAsia="Times New Roman"/>
             </w:rPr>
@@ -4294,7 +4270,7 @@
     <w:p>
       <w:pPr>
         <w:pStyle w:val="Text"/>
-        <w:ind w:left="1440"/>
+        <w:ind w:left="0"/>
         <w:rPr>
           <w:rFonts w:eastAsia="Times New Roman"/>
         </w:rPr>
@@ -4356,6 +4332,9 @@
             <m:t>=0.75</m:t>
           </m:r>
           <m:r>
+            <m:rPr>
+              <m:sty m:val="p"/>
+            </m:rPr>
             <w:rPr>
               <w:rFonts w:eastAsia="Times New Roman"/>
             </w:rPr>
@@ -4367,7 +4346,7 @@
     <w:p>
       <w:pPr>
         <w:pStyle w:val="Text"/>
-        <w:ind w:left="1440"/>
+        <w:ind w:left="0"/>
         <w:rPr>
           <w:rFonts w:eastAsia="Times New Roman"/>
         </w:rPr>
@@ -4429,6 +4408,9 @@
             <m:t>=0.0</m:t>
           </m:r>
           <m:r>
+            <m:rPr>
+              <m:sty m:val="p"/>
+            </m:rPr>
             <w:rPr>
               <w:rFonts w:eastAsia="Times New Roman"/>
             </w:rPr>
@@ -4570,12 +4552,15 @@
     <w:p>
       <w:pPr>
         <w:pStyle w:val="Text"/>
-        <w:ind w:left="1440"/>
+        <w:ind w:left="0"/>
         <w:rPr>
           <w:rFonts w:eastAsia="Times New Roman"/>
         </w:rPr>
       </w:pPr>
       <m:oMathPara>
+        <m:oMathParaPr>
+          <m:jc m:val="center"/>
+        </m:oMathParaPr>
         <m:oMath>
           <m:r>
             <m:rPr>
@@ -4654,6 +4639,9 @@
             <m:t>=1</m:t>
           </m:r>
           <m:r>
+            <m:rPr>
+              <m:sty m:val="p"/>
+            </m:rPr>
             <w:rPr>
               <w:rFonts w:eastAsia="Times New Roman"/>
             </w:rPr>
@@ -4665,12 +4653,15 @@
     <w:p>
       <w:pPr>
         <w:pStyle w:val="Text"/>
-        <w:ind w:left="1440"/>
+        <w:ind w:left="0"/>
         <w:rPr>
           <w:rFonts w:eastAsia="Times New Roman"/>
         </w:rPr>
       </w:pPr>
       <m:oMathPara>
+        <m:oMathParaPr>
+          <m:jc m:val="center"/>
+        </m:oMathParaPr>
         <m:oMath>
           <m:sSub>
             <m:sSubPr>
@@ -4727,6 +4718,9 @@
             <m:t>=0.0</m:t>
           </m:r>
           <m:r>
+            <m:rPr>
+              <m:sty m:val="p"/>
+            </m:rPr>
             <w:rPr>
               <w:rFonts w:eastAsia="Times New Roman"/>
             </w:rPr>
@@ -4738,12 +4732,15 @@
     <w:p>
       <w:pPr>
         <w:pStyle w:val="Text"/>
-        <w:ind w:left="1440"/>
+        <w:ind w:left="0"/>
         <w:rPr>
           <w:rFonts w:eastAsia="Times New Roman"/>
         </w:rPr>
       </w:pPr>
       <m:oMathPara>
+        <m:oMathParaPr>
+          <m:jc m:val="center"/>
+        </m:oMathParaPr>
         <m:oMath>
           <m:sSub>
             <m:sSubPr>
@@ -4800,6 +4797,9 @@
             <m:t>=0.75</m:t>
           </m:r>
           <m:r>
+            <m:rPr>
+              <m:sty m:val="p"/>
+            </m:rPr>
             <w:rPr>
               <w:rFonts w:eastAsia="Times New Roman"/>
             </w:rPr>
@@ -4811,7 +4811,6 @@
     <w:p>
       <w:pPr>
         <w:pStyle w:val="Text"/>
-        <w:ind w:left="1440"/>
         <w:jc w:val="center"/>
         <w:rPr>
           <w:rFonts w:eastAsia="Times New Roman"/>
@@ -4942,7 +4941,8 @@
     <w:p>
       <w:pPr>
         <w:pStyle w:val="Text"/>
-        <w:ind w:left="1440"/>
+        <w:ind w:left="0"/>
+        <w:jc w:val="center"/>
         <w:rPr>
           <w:rFonts w:eastAsia="Times New Roman"/>
         </w:rPr>
@@ -5026,6 +5026,9 @@
             <m:t>=0</m:t>
           </m:r>
           <m:r>
+            <m:rPr>
+              <m:sty m:val="p"/>
+            </m:rPr>
             <w:rPr>
               <w:rFonts w:eastAsia="Times New Roman"/>
             </w:rPr>
@@ -5037,7 +5040,8 @@
     <w:p>
       <w:pPr>
         <w:pStyle w:val="Text"/>
-        <w:ind w:left="1440"/>
+        <w:ind w:left="0"/>
+        <w:jc w:val="center"/>
         <w:rPr>
           <w:rFonts w:eastAsia="Times New Roman"/>
         </w:rPr>
@@ -5099,6 +5103,9 @@
             <m:t>=-0.75</m:t>
           </m:r>
           <m:r>
+            <m:rPr>
+              <m:sty m:val="p"/>
+            </m:rPr>
             <w:rPr>
               <w:rFonts w:eastAsia="Times New Roman"/>
             </w:rPr>
@@ -5110,7 +5117,8 @@
     <w:p>
       <w:pPr>
         <w:pStyle w:val="Text"/>
-        <w:ind w:left="1440"/>
+        <w:ind w:left="0"/>
+        <w:jc w:val="center"/>
         <w:rPr>
           <w:rFonts w:eastAsia="Times New Roman"/>
         </w:rPr>
@@ -5172,6 +5180,9 @@
             <m:t>=0.0</m:t>
           </m:r>
           <m:r>
+            <m:rPr>
+              <m:sty m:val="p"/>
+            </m:rPr>
             <w:rPr>
               <w:rFonts w:eastAsia="Times New Roman"/>
             </w:rPr>
@@ -5183,7 +5194,6 @@
     <w:p>
       <w:pPr>
         <w:pStyle w:val="Text"/>
-        <w:ind w:left="1440"/>
         <w:jc w:val="center"/>
         <w:rPr>
           <w:rFonts w:eastAsia="Times New Roman"/>

</xml_diff>